<commit_message>
Update brand assets for Vertiv / Transformation Manager
- og-image-v2.png, social-preview-v3.png, social-preview-v4.png: change baked
  logo subtitle "Global Payroll Implementation Expert" -> "Transformation Expert"
  (background-matched, font/color/position preserved)
- Chetan_Sharma_Resume.docx: header title -> Global Payroll Transformation Manager;
  add Vertiv current role (Mar 2026-Present, 54 countries/179 entities/37k employees);
  Deel ended Oct 2018 - Mar 2026 (role title preserved)
- sitemap.xml: fix broken image:loc (og-image.png -> social-preview-v4.png)

Co-Authored-By: Claude Opus 4.8 <noreply@anthropic.com>
Claude-Session: https://claude.ai/code/session_01QKcD4gk8cJZwTiCn3AgseM
</commit_message>
<xml_diff>
--- a/assets/documents/Chetan_Sharma_Resume.docx
+++ b/assets/documents/Chetan_Sharma_Resume.docx
@@ -24,7 +24,7 @@
           <w:rFonts w:ascii="Calibri" w:hAnsi="Calibri"/>
           <w:sz w:val="24"/>
         </w:rPr>
-        <w:t>Global Payroll Implementation Manager</w:t>
+        <w:t>Global Payroll Transformation Manager</w:t>
       </w:r>
     </w:p>
     <w:p>
@@ -146,6 +146,64 @@
           <w:b/>
           <w:sz w:val="24"/>
         </w:rPr>
+        <w:t>Global Payroll Transformation Manager</w:t>
+      </w:r>
+    </w:p>
+    <w:p>
+      <w:r>
+        <w:rPr>
+          <w:rFonts w:ascii="Calibri" w:hAnsi="Calibri"/>
+          <w:i/>
+        </w:rPr>
+        <w:t>Vertiv</w:t>
+      </w:r>
+      <w:r>
+        <w:rPr>
+          <w:rFonts w:ascii="Calibri" w:hAnsi="Calibri"/>
+        </w:rPr>
+        <w:t xml:space="preserve"> | March 2026 – Present</w:t>
+      </w:r>
+    </w:p>
+    <w:p>
+      <w:pPr>
+        <w:pStyle w:val="ListBullet"/>
+      </w:pPr>
+      <w:r>
+        <w:rPr>
+          <w:rFonts w:ascii="Calibri" w:hAnsi="Calibri"/>
+        </w:rPr>
+        <w:t>Leading global payroll transformation across 54 countries and 179 legal entities, covering ~37,000 employees</w:t>
+      </w:r>
+    </w:p>
+    <w:p>
+      <w:pPr>
+        <w:pStyle w:val="ListBullet"/>
+      </w:pPr>
+      <w:r>
+        <w:rPr>
+          <w:rFonts w:ascii="Calibri" w:hAnsi="Calibri"/>
+        </w:rPr>
+        <w:t>Driving standardization, vendor consolidation, and compliance governance across a complex, multi-entity global footprint</w:t>
+      </w:r>
+    </w:p>
+    <w:p>
+      <w:pPr>
+        <w:pStyle w:val="ListBullet"/>
+      </w:pPr>
+      <w:r>
+        <w:rPr>
+          <w:rFonts w:ascii="Calibri" w:hAnsi="Calibri"/>
+        </w:rPr>
+        <w:t>Building the target operating model and automation roadmap for a unified, scalable global payroll function</w:t>
+      </w:r>
+    </w:p>
+    <w:p>
+      <w:r>
+        <w:rPr>
+          <w:rFonts w:ascii="Calibri" w:hAnsi="Calibri"/>
+          <w:b/>
+          <w:sz w:val="24"/>
+        </w:rPr>
         <w:t>Global Payroll Implementation Manager</w:t>
       </w:r>
     </w:p>
@@ -161,7 +219,7 @@
         <w:rPr>
           <w:rFonts w:ascii="Calibri" w:hAnsi="Calibri"/>
         </w:rPr>
-        <w:t xml:space="preserve"> (formerly Safeguard Pay) | October 2018 – Present (6+ Years)</w:t>
+        <w:t xml:space="preserve"> (formerly Safeguard Pay) | October 2018 – March 2026 (7+ Years)</w:t>
       </w:r>
     </w:p>
     <w:p>

</xml_diff>

<commit_message>
Change contact email to chetanpayroll@gmail.com site-wide + resume
- Replace chetan@chetanpayroll.com -> chetanpayroll@gmail.com in all 21
  code files (mailto links, visible text, JSON-LD email, chatbot, newsletter,
  alert). Placeholder emails untouched.
- Resume .docx: email updated (Portfolio URL preserved)
- Bump cache version garnet-v3 -> garnet-v4 so updated chatbot JS + resume
  are fetched fresh
Cross-validated: 0 old email anywhere, new email in all files, resume opens
with new email, JSON-LD valid, chatbot + mailto links confirmed.

Co-Authored-By: Claude Opus 4.8 <noreply@anthropic.com>
Claude-Session: https://claude.ai/code/session_01QKcD4gk8cJZwTiCn3AgseM
</commit_message>
<xml_diff>
--- a/assets/documents/Chetan_Sharma_Resume.docx
+++ b/assets/documents/Chetan_Sharma_Resume.docx
@@ -43,28 +43,7 @@
           <w:rFonts w:ascii="Calibri" w:hAnsi="Calibri"/>
           <w:sz w:val="20"/>
         </w:rPr>
-        <w:t>chetan</w:t>
-      </w:r>
-      <w:r>
-        <w:rPr>
-          <w:rFonts w:ascii="Calibri" w:hAnsi="Calibri"/>
-          <w:sz w:val="20"/>
-        </w:rPr>
-        <w:t>@</w:t>
-      </w:r>
-      <w:r>
-        <w:rPr>
-          <w:rFonts w:ascii="Calibri" w:hAnsi="Calibri"/>
-          <w:sz w:val="20"/>
-        </w:rPr>
-        <w:t>chetanpayroll</w:t>
-      </w:r>
-      <w:r>
-        <w:rPr>
-          <w:rFonts w:ascii="Calibri" w:hAnsi="Calibri"/>
-          <w:sz w:val="20"/>
-        </w:rPr>
-        <w:t>.com</w:t>
+        <w:t>chetanpayroll@gmail.com</w:t>
       </w:r>
     </w:p>
     <w:p>

</xml_diff>